<commit_message>
feat(saff-study): publish specification and test suite v1.4
</commit_message>
<xml_diff>
--- a/output/docx/LoginExtratorAdministrador.docx
+++ b/output/docx/LoginExtratorAdministrador.docx
@@ -106,7 +106,7 @@
         <w:rPr>
           <w:sz w:val="20"/>
         </w:rPr>
-        <w:t/>
+        <w:t>O usuario deve estar logado</w:t>
       </w:r>
     </w:p>
     <w:tbl>
@@ -229,7 +229,7 @@
               <w:rPr>
                 <w:sz w:val="18"/>
               </w:rPr>
-              <w:t>administrador: digita o user e a password de um usuario administrador e pressiona o botao Login</w:t>
+              <w:t>administrador: digita o user e a password de um usuário administrador e pressiona o botao Login</w:t>
             </w:r>
           </w:p>
         </w:tc>
@@ -296,7 +296,7 @@
         <w:rPr>
           <w:sz w:val="20"/>
         </w:rPr>
-        <w:t/>
+        <w:t>O usuario deve estar logado</w:t>
       </w:r>
     </w:p>
     <w:tbl>
@@ -419,17 +419,17 @@
               <w:rPr>
                 <w:sz w:val="18"/>
               </w:rPr>
-              <w:t>administrador: digita o user de um usuário invalido, digita uma password e pressiona o botao Login</w:t>
-            </w:r>
-          </w:p>
-        </w:tc>
-        <w:tc>
-          <w:p>
-            <w:r>
-              <w:rPr>
-                <w:sz w:val="18"/>
-              </w:rPr>
-              <w:t>SYSTEM exibe na pagina de login uma mensagem de usuario ou senha incorretos</w:t>
+              <w:t>administrador: digita o user de um usuário inválido, digita uma password e pressiona o botao Login</w:t>
+            </w:r>
+          </w:p>
+        </w:tc>
+        <w:tc>
+          <w:p>
+            <w:r>
+              <w:rPr>
+                <w:sz w:val="18"/>
+              </w:rPr>
+              <w:t>SYSTEM exibe mensagem “Invalid user or password” na tela de login</w:t>
             </w:r>
           </w:p>
         </w:tc>
@@ -451,7 +451,39 @@
               <w:rPr>
                 <w:sz w:val="18"/>
               </w:rPr>
-              <w:t>administrador: digita o user e a password de um usuario administrador e pressiona o botao Login</w:t>
+              <w:t>system: SYSTEM: exibe tela de login</w:t>
+            </w:r>
+          </w:p>
+        </w:tc>
+        <w:tc>
+          <w:p>
+            <w:r>
+              <w:rPr>
+                <w:sz w:val="18"/>
+              </w:rPr>
+              <w:t>exibe tela de login</w:t>
+            </w:r>
+          </w:p>
+        </w:tc>
+      </w:tr>
+      <w:tr>
+        <w:tc>
+          <w:p>
+            <w:r>
+              <w:rPr>
+                <w:sz w:val="18"/>
+              </w:rPr>
+              <w:t>4</w:t>
+            </w:r>
+          </w:p>
+        </w:tc>
+        <w:tc>
+          <w:p>
+            <w:r>
+              <w:rPr>
+                <w:sz w:val="18"/>
+              </w:rPr>
+              <w:t>administrador: digita o user e a password de um usuário administrador e pressiona o botao Login</w:t>
             </w:r>
           </w:p>
         </w:tc>
@@ -518,7 +550,7 @@
         <w:rPr>
           <w:sz w:val="20"/>
         </w:rPr>
-        <w:t/>
+        <w:t>O usuario deve estar logado</w:t>
       </w:r>
     </w:p>
     <w:tbl>
@@ -651,7 +683,7 @@
               <w:rPr>
                 <w:sz w:val="18"/>
               </w:rPr>
-              <w:t>SYSTEM abre um pop-up e exibe a mensagem de usuario ou senha incorretos; informa o numero de tentativas restantes ate que o usuario seja bloqueado</w:t>
+              <w:t>SYSTEM abre um pop-up e exibe a mensagem “User or Password incorrect. Attempts remaining until the account lockout: #tentativas restantes#” em um pop-up</w:t>
             </w:r>
           </w:p>
         </w:tc>
@@ -705,7 +737,39 @@
               <w:rPr>
                 <w:sz w:val="18"/>
               </w:rPr>
-              <w:t>administrador: digita o user e a password de um usuario administrador e pressiona o botao Login</w:t>
+              <w:t>system: SYSTEM: exibe tela de login</w:t>
+            </w:r>
+          </w:p>
+        </w:tc>
+        <w:tc>
+          <w:p>
+            <w:r>
+              <w:rPr>
+                <w:sz w:val="18"/>
+              </w:rPr>
+              <w:t>exibe tela de login</w:t>
+            </w:r>
+          </w:p>
+        </w:tc>
+      </w:tr>
+      <w:tr>
+        <w:tc>
+          <w:p>
+            <w:r>
+              <w:rPr>
+                <w:sz w:val="18"/>
+              </w:rPr>
+              <w:t>5</w:t>
+            </w:r>
+          </w:p>
+        </w:tc>
+        <w:tc>
+          <w:p>
+            <w:r>
+              <w:rPr>
+                <w:sz w:val="18"/>
+              </w:rPr>
+              <w:t>administrador: digita o user e a password de um usuário administrador e pressiona o botao Login</w:t>
             </w:r>
           </w:p>
         </w:tc>
@@ -772,7 +836,7 @@
         <w:rPr>
           <w:sz w:val="20"/>
         </w:rPr>
-        <w:t/>
+        <w:t>O usuario deve estar logado</w:t>
       </w:r>
     </w:p>
     <w:tbl>
@@ -895,17 +959,17 @@
               <w:rPr>
                 <w:sz w:val="18"/>
               </w:rPr>
-              <w:t>administrador: digita o user correte e o password invalido pela sexta vez e pressiona o botao Login</w:t>
-            </w:r>
-          </w:p>
-        </w:tc>
-        <w:tc>
-          <w:p>
-            <w:r>
-              <w:rPr>
-                <w:sz w:val="18"/>
-              </w:rPr>
-              <w:t>SYSTEM bloqueia o usuario e exibe uma mensagem informando que o usuario foi bloqueado</w:t>
+              <w:t>administrador: digita o user de um usuario administrador corretamente, digita uma password invalida pela sexta vez e pressiona o botao Login</w:t>
+            </w:r>
+          </w:p>
+        </w:tc>
+        <w:tc>
+          <w:p>
+            <w:r>
+              <w:rPr>
+                <w:sz w:val="18"/>
+              </w:rPr>
+              <w:t>SYSTEM bloqueia o usuário e exibe a mensagem 'This user has been blocked'</w:t>
             </w:r>
           </w:p>
         </w:tc>
@@ -937,7 +1001,7 @@
               <w:rPr>
                 <w:sz w:val="18"/>
               </w:rPr>
-              <w:t>SYSTEM exibe mensagem informando usuario esta bloqueado</w:t>
+              <w:t>SYSTEM exibe mensagem informando usuario está bloqueado</w:t>
             </w:r>
           </w:p>
         </w:tc>
@@ -1117,7 +1181,7 @@
               <w:rPr>
                 <w:sz w:val="18"/>
               </w:rPr>
-              <w:t>administrador: digita o user e a password de um usuario administrador e pressiona o botao Login</w:t>
+              <w:t>administrador: digita o user e a password de um usuário administrador e pressiona o botao Login</w:t>
             </w:r>
           </w:p>
         </w:tc>
@@ -1180,7 +1244,7 @@
           <w:sz w:val="24"/>
           <w:color w:val="2B6CB0"/>
         </w:rPr>
-        <w:t>[TC6] Exception Flow 2: Sem conexao com o servidor e usuario nao deseja fazer extração offline</w:t>
+        <w:t>[TC6] Exception Flow 2: Sem conexao com o servidor e usuário nao deseja fazer extração offline</w:t>
       </w:r>
     </w:p>
     <w:p>
@@ -1339,7 +1403,7 @@
               <w:rPr>
                 <w:sz w:val="18"/>
               </w:rPr>
-              <w:t>administrador: digita o user e a password de um usuario administrador e pressiona o botao Login</w:t>
+              <w:t>administrador: digita o user e a password de um usuário administrador e pressiona o botao Login</w:t>
             </w:r>
           </w:p>
         </w:tc>
@@ -1561,17 +1625,49 @@
               <w:rPr>
                 <w:sz w:val="18"/>
               </w:rPr>
-              <w:t>administrador: digita o user e a password de um usuario administrador e pressiona o botao Login</w:t>
-            </w:r>
-          </w:p>
-        </w:tc>
-        <w:tc>
-          <w:p>
-            <w:r>
-              <w:rPr>
-                <w:sz w:val="18"/>
-              </w:rPr>
-              <w:t>SYSTEM exibe mensagem indicando que usuario foi bloqueado</w:t>
+              <w:t>administrador: digita o user e a password de um usuário administrador e pressiona o botao Login</w:t>
+            </w:r>
+          </w:p>
+        </w:tc>
+        <w:tc>
+          <w:p>
+            <w:r>
+              <w:rPr>
+                <w:sz w:val="18"/>
+              </w:rPr>
+              <w:t>SYSTEM exibe a mensagem 'This user has been blocked'</w:t>
+            </w:r>
+          </w:p>
+        </w:tc>
+      </w:tr>
+      <w:tr>
+        <w:tc>
+          <w:p>
+            <w:r>
+              <w:rPr>
+                <w:sz w:val="18"/>
+              </w:rPr>
+              <w:t>3</w:t>
+            </w:r>
+          </w:p>
+        </w:tc>
+        <w:tc>
+          <w:p>
+            <w:r>
+              <w:rPr>
+                <w:sz w:val="18"/>
+              </w:rPr>
+              <w:t>administrador: executa programa externo que reinicia senha de super admin</w:t>
+            </w:r>
+          </w:p>
+        </w:tc>
+        <w:tc>
+          <w:p>
+            <w:r>
+              <w:rPr>
+                <w:sz w:val="18"/>
+              </w:rPr>
+              <w:t>SYSTEM processes action successfully</w:t>
             </w:r>
           </w:p>
         </w:tc>

</xml_diff>